<commit_message>
AI policy kit: add prominent legal disclaimer, date (Aug 18 2026), monthly review
Per direction: every kit document now carries a clear disclaimer that it is a
template/guideline, not legal advice; review with your legal team before editing,
deploying, or relying on it, and confirm it meets your organization's standards,
jurisdiction, vertical, and certification requirements (you may need to add,
remove, or revise language). The framework closes with a full IMPORTANT callout;
the other docs carry a concise dated version. All are dated 'Issued August 18,
2026' with a 'review monthly' recommendation, reflecting AI's rapid change.

Co-Authored-By: Claude Opus 5 <noreply@anthropic.com>
</commit_message>
<xml_diff>
--- a/public/downloads/AI-Usage-Policy-Framework.docx
+++ b/public/downloads/AI-Usage-Policy-Framework.docx
@@ -162,7 +162,7 @@
           <w:szCs w:val="21"/>
           <w:rFonts w:ascii="Calibri" w:cs="Calibri" w:eastAsia="Calibri" w:hAnsi="Calibri"/>
         </w:rPr>
-        <w:t xml:space="preserve">Version  </w:t>
+        <w:t xml:space="preserve">Framework version  </w:t>
       </w:r>
       <w:r>
         <w:rPr>
@@ -182,7 +182,7 @@
           <w:szCs w:val="21"/>
           <w:rFonts w:ascii="Calibri" w:cs="Calibri" w:eastAsia="Calibri" w:hAnsi="Calibri"/>
         </w:rPr>
-        <w:t xml:space="preserve">       Effective  </w:t>
+        <w:t xml:space="preserve">        Issued  </w:t>
       </w:r>
       <w:r>
         <w:rPr>
@@ -193,8 +193,33 @@
           <w:szCs w:val="21"/>
           <w:rFonts w:ascii="Calibri" w:cs="Calibri" w:eastAsia="Calibri" w:hAnsi="Calibri"/>
         </w:rPr>
+        <w:t xml:space="preserve">August 18, 2026</w:t>
+      </w:r>
+      <w:r>
+        <w:rPr>
+          <w:color w:val="6B7C8B"/>
+          <w:sz w:val="21"/>
+          <w:szCs w:val="21"/>
+          <w:rFonts w:ascii="Calibri" w:cs="Calibri" w:eastAsia="Calibri" w:hAnsi="Calibri"/>
+        </w:rPr>
+        <w:t xml:space="preserve">        Your adoption date  </w:t>
+      </w:r>
+      <w:r>
+        <w:rPr>
+          <w:b/>
+          <w:bCs/>
+          <w:color w:val="0C1622"/>
+          <w:sz w:val="21"/>
+          <w:szCs w:val="21"/>
+          <w:rFonts w:ascii="Calibri" w:cs="Calibri" w:eastAsia="Calibri" w:hAnsi="Calibri"/>
+        </w:rPr>
         <w:t xml:space="preserve">[Date]</w:t>
       </w:r>
+    </w:p>
+    <w:p>
+      <w:pPr>
+        <w:spacing w:after="60" w:line="276" w:before="0"/>
+      </w:pPr>
       <w:r>
         <w:rPr>
           <w:color w:val="6B7C8B"/>
@@ -202,7 +227,7 @@
           <w:szCs w:val="21"/>
           <w:rFonts w:ascii="Calibri" w:cs="Calibri" w:eastAsia="Calibri" w:hAnsi="Calibri"/>
         </w:rPr>
-        <w:t xml:space="preserve">       Next review  </w:t>
+        <w:t xml:space="preserve">Recommended review  </w:t>
       </w:r>
       <w:r>
         <w:rPr>
@@ -213,7 +238,16 @@
           <w:szCs w:val="21"/>
           <w:rFonts w:ascii="Calibri" w:cs="Calibri" w:eastAsia="Calibri" w:hAnsi="Calibri"/>
         </w:rPr>
-        <w:t xml:space="preserve">[Date + 6 months]</w:t>
+        <w:t xml:space="preserve">Monthly</w:t>
+      </w:r>
+      <w:r>
+        <w:rPr>
+          <w:color w:val="3C4A57"/>
+          <w:sz w:val="21"/>
+          <w:szCs w:val="21"/>
+          <w:rFonts w:ascii="Calibri" w:cs="Calibri" w:eastAsia="Calibri" w:hAnsi="Calibri"/>
+        </w:rPr>
+        <w:t xml:space="preserve"> — AI tools and the laws that govern them are changing rapidly.</w:t>
       </w:r>
     </w:p>
     <w:p>
@@ -4265,11 +4299,162 @@
       </w:r>
     </w:p>
     <w:p>
+      <w:r>
+        <w:br w:type="page"/>
+      </w:r>
+    </w:p>
+    <w:p>
+      <w:pPr>
+        <w:spacing w:before="220" w:after="60"/>
+      </w:pPr>
+      <w:r>
+        <w:rPr>
+          <w:b/>
+          <w:bCs/>
+          <w:color w:val="12A5DB"/>
+          <w:sz w:val="16"/>
+          <w:szCs w:val="16"/>
+          <w:caps/>
+          <w:rFonts w:ascii="Calibri" w:cs="Calibri" w:eastAsia="Calibri" w:hAnsi="Calibri"/>
+          <w:spacing w:val="30"/>
+        </w:rPr>
+        <w:t xml:space="preserve">Important</w:t>
+      </w:r>
+    </w:p>
+    <w:p>
+      <w:pPr>
+        <w:pStyle w:val="Heading1"/>
+        <w:spacing w:before="340" w:after="130"/>
+      </w:pPr>
+      <w:r>
+        <w:rPr>
+          <w:b/>
+          <w:bCs/>
+          <w:color w:val="0B2440"/>
+          <w:sz w:val="30"/>
+          <w:szCs w:val="30"/>
+          <w:rFonts w:ascii="Calibri" w:cs="Calibri" w:eastAsia="Calibri" w:hAnsi="Calibri"/>
+        </w:rPr>
+        <w:t xml:space="preserve">Important — read before using this framework</w:t>
+      </w:r>
+    </w:p>
+    <w:p>
       <w:pPr>
         <w:pBdr>
+          <w:bottom w:val="single" w:color="12A5DB" w:sz="6"/>
+        </w:pBdr>
+        <w:spacing w:before="60" w:after="160"/>
+      </w:pPr>
+    </w:p>
+    <w:tbl>
+      <w:tblPr>
+        <w:tblW w:type="dxa" w:w="9360"/>
+        <w:tblBorders>
           <w:top w:val="single" w:color="DCE4EA" w:sz="2"/>
-        </w:pBdr>
-        <w:spacing w:before="500"/>
+          <w:left w:val="single" w:color="12A5DB" w:sz="24"/>
+          <w:bottom w:val="single" w:color="DCE4EA" w:sz="2"/>
+          <w:right w:val="single" w:color="DCE4EA" w:sz="2"/>
+          <w:insideH w:val="none"/>
+          <w:insideV w:val="none"/>
+        </w:tblBorders>
+      </w:tblPr>
+      <w:tblGrid>
+        <w:gridCol w:w="9360"/>
+      </w:tblGrid>
+      <w:tr>
+        <w:tc>
+          <w:tcPr>
+            <w:tcW w:type="dxa" w:w="9360"/>
+            <w:shd w:fill="F2F6F9" w:color="auto" w:val="clear"/>
+            <w:tcMar>
+              <w:top w:type="dxa" w:w="130"/>
+              <w:left w:type="dxa" w:w="200"/>
+              <w:bottom w:type="dxa" w:w="130"/>
+              <w:right w:type="dxa" w:w="160"/>
+            </w:tcMar>
+          </w:tcPr>
+          <w:p>
+            <w:pPr>
+              <w:spacing w:after="70"/>
+            </w:pPr>
+            <w:r>
+              <w:rPr>
+                <w:b/>
+                <w:bCs/>
+                <w:color w:val="0B2440"/>
+                <w:sz w:val="17"/>
+                <w:szCs w:val="17"/>
+                <w:caps/>
+                <w:rFonts w:ascii="Calibri" w:cs="Calibri" w:eastAsia="Calibri" w:hAnsi="Calibri"/>
+                <w:spacing w:val="20"/>
+              </w:rPr>
+              <w:t xml:space="preserve">This is a template and a guideline — not legal advice</w:t>
+            </w:r>
+          </w:p>
+          <w:p>
+            <w:pPr>
+              <w:spacing w:after="80" w:line="272"/>
+            </w:pPr>
+            <w:r>
+              <w:rPr>
+                <w:color w:val="0C1622"/>
+                <w:sz w:val="21"/>
+                <w:szCs w:val="21"/>
+                <w:rFonts w:ascii="Calibri" w:cs="Calibri" w:eastAsia="Calibri" w:hAnsi="Calibri"/>
+              </w:rPr>
+              <w:t xml:space="preserve">This document is a framework and template provided for general informational purposes only. It is not legal advice and does not create an attorney-client relationship.</w:t>
+            </w:r>
+          </w:p>
+          <w:p>
+            <w:pPr>
+              <w:spacing w:after="80" w:line="272"/>
+            </w:pPr>
+            <w:r>
+              <w:rPr>
+                <w:color w:val="0C1622"/>
+                <w:sz w:val="21"/>
+                <w:szCs w:val="21"/>
+                <w:rFonts w:ascii="Calibri" w:cs="Calibri" w:eastAsia="Calibri" w:hAnsi="Calibri"/>
+              </w:rPr>
+              <w:t xml:space="preserve">Before editing, deploying, distributing, or relying on any part of it, review it with your own qualified legal team. Confirm it meets the standards and requirements of your organization, your jurisdiction, your industry or vertical, and any certifications or regulatory frameworks that apply to you — for example HIPAA, GLBA, PCI DSS, CJIS, SOC 2, ISO 27001, and CPRA/CCPA.</w:t>
+            </w:r>
+          </w:p>
+          <w:p>
+            <w:pPr>
+              <w:spacing w:after="80" w:line="272"/>
+            </w:pPr>
+            <w:r>
+              <w:rPr>
+                <w:color w:val="0C1622"/>
+                <w:sz w:val="21"/>
+                <w:szCs w:val="21"/>
+                <w:rFonts w:ascii="Calibri" w:cs="Calibri" w:eastAsia="Calibri" w:hAnsi="Calibri"/>
+              </w:rPr>
+              <w:t xml:space="preserve">You may need to add, remove, or revise provisions — including specific language, tools, and obligations — for this document to be accurate, compliant, and enforceable for your organization. If any part of it conflicts with an executed agreement or with applicable law, that agreement or law controls.</w:t>
+            </w:r>
+          </w:p>
+          <w:p>
+            <w:pPr>
+              <w:spacing w:after="0" w:line="272"/>
+            </w:pPr>
+            <w:r>
+              <w:rPr>
+                <w:b/>
+                <w:bCs/>
+                <w:color w:val="0B2440"/>
+                <w:sz w:val="21"/>
+                <w:szCs w:val="21"/>
+                <w:rFonts w:ascii="Calibri" w:cs="Calibri" w:eastAsia="Calibri" w:hAnsi="Calibri"/>
+              </w:rPr>
+              <w:t xml:space="preserve">Artificial intelligence, the tools that deliver it, and the laws that govern it are evolving rapidly. Review and update this document regularly; we recommend revisiting it monthly.</w:t>
+            </w:r>
+          </w:p>
+        </w:tc>
+      </w:tr>
+    </w:tbl>
+    <w:p>
+      <w:pPr>
+        <w:spacing w:before="200"/>
       </w:pPr>
       <w:r>
         <w:rPr>
@@ -4280,7 +4465,7 @@
           <w:szCs w:val="17"/>
           <w:rFonts w:ascii="Calibri" w:cs="Calibri" w:eastAsia="Calibri" w:hAnsi="Calibri"/>
         </w:rPr>
-        <w:t xml:space="preserve">This framework is provided “as-is” for general information and is not legal advice; review with qualified counsel before adoption. If it conflicts with an executed contract or governing law, the contract or law controls. Provided by Fortify AI.</w:t>
+        <w:t xml:space="preserve">Issued August 18, 2026  ·  Version 1.0  ·  Provided by Fortify AI  ·  Not legal advice.</w:t>
       </w:r>
     </w:p>
     <w:sectPr>

</xml_diff>